<commit_message>
Update quote template với định dạng mới
Co-Authored-By: Claude Sonnet 4.6 <noreply@anthropic.com>
</commit_message>
<xml_diff>
--- a/templates/quote-template.docx
+++ b/templates/quote-template.docx
@@ -1,6 +1,6 @@
 
 <file path=word/document.xml><?xml version="1.0" encoding="utf-8"?>
-<w:document xmlns:wpc="http://schemas.microsoft.com/office/word/2010/wordprocessingCanvas" xmlns:cx="http://schemas.microsoft.com/office/drawing/2014/chartex" xmlns:cx1="http://schemas.microsoft.com/office/drawing/2015/9/8/chartex" xmlns:cx2="http://schemas.microsoft.com/office/drawing/2015/10/21/chartex" xmlns:cx3="http://schemas.microsoft.com/office/drawing/2016/5/9/chartex" xmlns:cx4="http://schemas.microsoft.com/office/drawing/2016/5/10/chartex" xmlns:cx5="http://schemas.microsoft.com/office/drawing/2016/5/11/chartex" xmlns:cx6="http://schemas.microsoft.com/office/drawing/2016/5/12/chartex" xmlns:cx7="http://schemas.microsoft.com/office/drawing/2016/5/13/chartex" xmlns:cx8="http://schemas.microsoft.com/office/drawing/2016/5/14/chartex" xmlns:mc="http://schemas.openxmlformats.org/markup-compatibility/2006" xmlns:aink="http://schemas.microsoft.com/office/drawing/2016/ink" xmlns:am3d="http://schemas.microsoft.com/office/drawing/2017/model3d" xmlns:o="urn:schemas-microsoft-com:office:office" xmlns:r="http://schemas.openxmlformats.org/officeDocument/2006/relationships" xmlns:m="http://schemas.openxmlformats.org/officeDocument/2006/math" xmlns:v="urn:schemas-microsoft-com:vml" xmlns:wp14="http://schemas.microsoft.com/office/word/2010/wordprocessingDrawing" xmlns:wp="http://schemas.openxmlformats.org/drawingml/2006/wordprocessingDrawing" xmlns:w10="urn:schemas-microsoft-com:office:word" xmlns:w="http://schemas.openxmlformats.org/wordprocessingml/2006/main" xmlns:w14="http://schemas.microsoft.com/office/word/2010/wordml" xmlns:w15="http://schemas.microsoft.com/office/word/2012/wordml" xmlns:w16cex="http://schemas.microsoft.com/office/word/2018/wordml/cex" xmlns:w16cid="http://schemas.microsoft.com/office/word/2016/wordml/cid" xmlns:w16="http://schemas.microsoft.com/office/word/2018/wordml" xmlns:w16sdtdh="http://schemas.microsoft.com/office/word/2020/wordml/sdtdatahash" xmlns:w16se="http://schemas.microsoft.com/office/word/2015/wordml/symex" xmlns:wpg="http://schemas.microsoft.com/office/word/2010/wordprocessingGroup" xmlns:wpi="http://schemas.microsoft.com/office/word/2010/wordprocessingInk" xmlns:wne="http://schemas.microsoft.com/office/word/2006/wordml" xmlns:wps="http://schemas.microsoft.com/office/word/2010/wordprocessingShape" mc:Ignorable="w14 w15 w16se w16cid w16 w16cex w16sdtdh wp14">
+<w:document xmlns:wpc="http://schemas.microsoft.com/office/word/2010/wordprocessingCanvas" xmlns:cx="http://schemas.microsoft.com/office/drawing/2014/chartex" xmlns:mc="http://schemas.openxmlformats.org/markup-compatibility/2006" xmlns:o="urn:schemas-microsoft-com:office:office" xmlns:r="http://schemas.openxmlformats.org/officeDocument/2006/relationships" xmlns:m="http://schemas.openxmlformats.org/officeDocument/2006/math" xmlns:v="urn:schemas-microsoft-com:vml" xmlns:wp14="http://schemas.microsoft.com/office/word/2010/wordprocessingDrawing" xmlns:wp="http://schemas.openxmlformats.org/drawingml/2006/wordprocessingDrawing" xmlns:w10="urn:schemas-microsoft-com:office:word" xmlns:w="http://schemas.openxmlformats.org/wordprocessingml/2006/main" xmlns:w14="http://schemas.microsoft.com/office/word/2010/wordml" xmlns:w15="http://schemas.microsoft.com/office/word/2012/wordml" xmlns:w16se="http://schemas.microsoft.com/office/word/2015/wordml/symex" xmlns:wpg="http://schemas.microsoft.com/office/word/2010/wordprocessingGroup" xmlns:wpi="http://schemas.microsoft.com/office/word/2010/wordprocessingInk" xmlns:wne="http://schemas.microsoft.com/office/word/2006/wordml" xmlns:wps="http://schemas.microsoft.com/office/word/2010/wordprocessingShape" mc:Ignorable="w14 w15 w16se wp14">
   <w:body>
     <w:tbl>
       <w:tblPr>
@@ -92,7 +92,7 @@
             <v:path o:extrusionok="f" gradientshapeok="t" o:connecttype="rect"/>
             <o:lock v:ext="edit" aspectratio="t"/>
           </v:shapetype>
-          <v:shape id="_x0000_s1031" type="#_x0000_t75" style="position:absolute;left:0;text-align:left;margin-left:-21.6pt;margin-top:-29.15pt;width:94.4pt;height:49.6pt;z-index:251658752;mso-position-horizontal-relative:text;mso-position-vertical-relative:text">
+          <v:shape id="_x0000_s1031" type="#_x0000_t75" style="position:absolute;left:0;text-align:left;margin-left:-21.6pt;margin-top:-29.15pt;width:94.4pt;height:49.6pt;z-index:3;mso-position-horizontal-relative:text;mso-position-vertical-relative:text">
             <v:imagedata r:id="rId8" o:title="Logo_TINHTUE"/>
           </v:shape>
         </w:pict>
@@ -102,7 +102,7 @@
           <w:noProof/>
         </w:rPr>
         <w:pict>
-          <v:shape id="_x0000_s1030" type="#_x0000_t75" style="position:absolute;left:0;text-align:left;margin-left:320.6pt;margin-top:-27.4pt;width:158.95pt;height:58.4pt;z-index:251657728;mso-position-horizontal-relative:text;mso-position-vertical-relative:text">
+          <v:shape id="_x0000_s1030" type="#_x0000_t75" style="position:absolute;left:0;text-align:left;margin-left:320.6pt;margin-top:-27.4pt;width:158.95pt;height:58.4pt;z-index:2;mso-position-horizontal-relative:text;mso-position-vertical-relative:text">
             <v:imagedata r:id="rId9" o:title="Asset 2@3x"/>
           </v:shape>
         </w:pict>
@@ -117,7 +117,7 @@
           <w:lang w:val="vi-VN"/>
         </w:rPr>
         <w:pict>
-          <v:shape id="_x0000_s1029" type="#_x0000_t75" style="position:absolute;left:0;text-align:left;margin-left:92.4pt;margin-top:-28.1pt;width:143.25pt;height:37.05pt;z-index:251656704;mso-position-horizontal-relative:text;mso-position-vertical-relative:text">
+          <v:shape id="_x0000_s1029" type="#_x0000_t75" style="position:absolute;left:0;text-align:left;margin-left:92.4pt;margin-top:-28.1pt;width:143.25pt;height:37.05pt;z-index:1;mso-position-horizontal-relative:text;mso-position-vertical-relative:text">
             <v:imagedata r:id="rId10" o:title="elidefire_wordmark"/>
           </v:shape>
         </w:pict>
@@ -167,7 +167,7 @@
     </w:p>
     <w:tbl>
       <w:tblPr>
-        <w:tblW w:w="9999" w:type="dxa"/>
+        <w:tblW w:w="10005" w:type="dxa"/>
         <w:tblInd w:w="-252" w:type="dxa"/>
         <w:tblBorders>
           <w:top w:val="single" w:sz="4" w:space="0" w:color="auto"/>
@@ -179,21 +179,21 @@
         <w:tblLook w:val="01E0" w:firstRow="1" w:lastRow="1" w:firstColumn="1" w:lastColumn="1" w:noHBand="0" w:noVBand="0"/>
       </w:tblPr>
       <w:tblGrid>
-        <w:gridCol w:w="1620"/>
+        <w:gridCol w:w="1440"/>
         <w:gridCol w:w="4410"/>
-        <w:gridCol w:w="1325"/>
-        <w:gridCol w:w="2545"/>
-        <w:gridCol w:w="99"/>
+        <w:gridCol w:w="1440"/>
+        <w:gridCol w:w="2610"/>
+        <w:gridCol w:w="105"/>
       </w:tblGrid>
       <w:tr>
         <w:trPr>
           <w:gridAfter w:val="1"/>
-          <w:wAfter w:w="99" w:type="dxa"/>
+          <w:wAfter w:w="105" w:type="dxa"/>
           <w:trHeight w:val="323"/>
         </w:trPr>
         <w:tc>
           <w:tcPr>
-            <w:tcW w:w="1620" w:type="dxa"/>
+            <w:tcW w:w="1440" w:type="dxa"/>
             <w:tcBorders>
               <w:bottom w:val="dotted" w:sz="4" w:space="0" w:color="auto"/>
               <w:right w:val="nil"/>
@@ -318,7 +318,7 @@
         </w:tc>
         <w:tc>
           <w:tcPr>
-            <w:tcW w:w="1325" w:type="dxa"/>
+            <w:tcW w:w="1440" w:type="dxa"/>
             <w:tcBorders>
               <w:bottom w:val="dotted" w:sz="4" w:space="0" w:color="auto"/>
               <w:right w:val="nil"/>
@@ -351,7 +351,7 @@
         </w:tc>
         <w:tc>
           <w:tcPr>
-            <w:tcW w:w="2545" w:type="dxa"/>
+            <w:tcW w:w="2610" w:type="dxa"/>
             <w:tcBorders>
               <w:left w:val="nil"/>
               <w:bottom w:val="dotted" w:sz="4" w:space="0" w:color="auto"/>
@@ -388,7 +388,7 @@
                 <w:sz w:val="20"/>
                 <w:szCs w:val="20"/>
               </w:rPr>
-              <w:t xml:space="preserve">{d.ten_cong_ty}</w:t>
+              <w:t>{d.ten_cong_ty}</w:t>
             </w:r>
           </w:p>
         </w:tc>
@@ -396,12 +396,12 @@
       <w:tr>
         <w:trPr>
           <w:gridAfter w:val="1"/>
-          <w:wAfter w:w="99" w:type="dxa"/>
+          <w:wAfter w:w="105" w:type="dxa"/>
           <w:trHeight w:val="341"/>
         </w:trPr>
         <w:tc>
           <w:tcPr>
-            <w:tcW w:w="1620" w:type="dxa"/>
+            <w:tcW w:w="1440" w:type="dxa"/>
             <w:tcBorders>
               <w:top w:val="dotted" w:sz="4" w:space="0" w:color="auto"/>
               <w:bottom w:val="dotted" w:sz="4" w:space="0" w:color="auto"/>
@@ -484,7 +484,7 @@
         </w:tc>
         <w:tc>
           <w:tcPr>
-            <w:tcW w:w="1325" w:type="dxa"/>
+            <w:tcW w:w="1440" w:type="dxa"/>
             <w:tcBorders>
               <w:top w:val="dotted" w:sz="4" w:space="0" w:color="auto"/>
               <w:bottom w:val="dotted" w:sz="4" w:space="0" w:color="auto"/>
@@ -520,7 +520,7 @@
         </w:tc>
         <w:tc>
           <w:tcPr>
-            <w:tcW w:w="2545" w:type="dxa"/>
+            <w:tcW w:w="2610" w:type="dxa"/>
             <w:tcBorders>
               <w:top w:val="dotted" w:sz="4" w:space="0" w:color="auto"/>
               <w:left w:val="nil"/>
@@ -571,7 +571,7 @@
                 <w:sz w:val="20"/>
                 <w:szCs w:val="20"/>
               </w:rPr>
-              <w:t xml:space="preserve">{d.ten_phong_ban}</w:t>
+              <w:t>{d.ten_phong_ban}</w:t>
             </w:r>
           </w:p>
         </w:tc>
@@ -579,12 +579,12 @@
       <w:tr>
         <w:trPr>
           <w:gridAfter w:val="1"/>
-          <w:wAfter w:w="99" w:type="dxa"/>
+          <w:wAfter w:w="105" w:type="dxa"/>
           <w:trHeight w:val="350"/>
         </w:trPr>
         <w:tc>
           <w:tcPr>
-            <w:tcW w:w="1620" w:type="dxa"/>
+            <w:tcW w:w="1440" w:type="dxa"/>
             <w:tcBorders>
               <w:top w:val="dotted" w:sz="4" w:space="0" w:color="auto"/>
               <w:bottom w:val="dotted" w:sz="4" w:space="0" w:color="auto"/>
@@ -665,7 +665,7 @@
         </w:tc>
         <w:tc>
           <w:tcPr>
-            <w:tcW w:w="1325" w:type="dxa"/>
+            <w:tcW w:w="1440" w:type="dxa"/>
             <w:tcBorders>
               <w:top w:val="dotted" w:sz="4" w:space="0" w:color="auto"/>
               <w:bottom w:val="dotted" w:sz="4" w:space="0" w:color="auto"/>
@@ -701,7 +701,7 @@
         </w:tc>
         <w:tc>
           <w:tcPr>
-            <w:tcW w:w="2545" w:type="dxa"/>
+            <w:tcW w:w="2610" w:type="dxa"/>
             <w:tcBorders>
               <w:top w:val="dotted" w:sz="4" w:space="0" w:color="auto"/>
               <w:left w:val="nil"/>
@@ -749,12 +749,12 @@
       <w:tr>
         <w:trPr>
           <w:gridAfter w:val="1"/>
-          <w:wAfter w:w="99" w:type="dxa"/>
+          <w:wAfter w:w="105" w:type="dxa"/>
           <w:trHeight w:val="350"/>
         </w:trPr>
         <w:tc>
           <w:tcPr>
-            <w:tcW w:w="1620" w:type="dxa"/>
+            <w:tcW w:w="1440" w:type="dxa"/>
             <w:tcBorders>
               <w:top w:val="dotted" w:sz="4" w:space="0" w:color="auto"/>
               <w:bottom w:val="dotted" w:sz="4" w:space="0" w:color="auto"/>
@@ -838,7 +838,7 @@
         </w:tc>
         <w:tc>
           <w:tcPr>
-            <w:tcW w:w="1325" w:type="dxa"/>
+            <w:tcW w:w="1440" w:type="dxa"/>
             <w:tcBorders>
               <w:top w:val="dotted" w:sz="4" w:space="0" w:color="auto"/>
               <w:bottom w:val="dotted" w:sz="4" w:space="0" w:color="auto"/>
@@ -874,7 +874,7 @@
         </w:tc>
         <w:tc>
           <w:tcPr>
-            <w:tcW w:w="2545" w:type="dxa"/>
+            <w:tcW w:w="2610" w:type="dxa"/>
             <w:tcBorders>
               <w:top w:val="dotted" w:sz="4" w:space="0" w:color="auto"/>
               <w:left w:val="nil"/>
@@ -934,12 +934,12 @@
       <w:tr>
         <w:trPr>
           <w:gridAfter w:val="1"/>
-          <w:wAfter w:w="99" w:type="dxa"/>
+          <w:wAfter w:w="105" w:type="dxa"/>
           <w:trHeight w:val="323"/>
         </w:trPr>
         <w:tc>
           <w:tcPr>
-            <w:tcW w:w="1620" w:type="dxa"/>
+            <w:tcW w:w="1440" w:type="dxa"/>
             <w:tcBorders>
               <w:top w:val="dotted" w:sz="4" w:space="0" w:color="auto"/>
               <w:bottom w:val="dotted" w:sz="4" w:space="0" w:color="auto"/>
@@ -1020,7 +1020,7 @@
         </w:tc>
         <w:tc>
           <w:tcPr>
-            <w:tcW w:w="1325" w:type="dxa"/>
+            <w:tcW w:w="1440" w:type="dxa"/>
             <w:tcBorders>
               <w:top w:val="dotted" w:sz="4" w:space="0" w:color="auto"/>
               <w:bottom w:val="dotted" w:sz="4" w:space="0" w:color="auto"/>
@@ -1056,7 +1056,7 @@
         </w:tc>
         <w:tc>
           <w:tcPr>
-            <w:tcW w:w="2545" w:type="dxa"/>
+            <w:tcW w:w="2610" w:type="dxa"/>
             <w:tcBorders>
               <w:top w:val="dotted" w:sz="4" w:space="0" w:color="auto"/>
               <w:left w:val="nil"/>
@@ -1115,12 +1115,12 @@
       <w:tr>
         <w:trPr>
           <w:gridAfter w:val="1"/>
-          <w:wAfter w:w="99" w:type="dxa"/>
+          <w:wAfter w:w="105" w:type="dxa"/>
           <w:trHeight w:val="350"/>
         </w:trPr>
         <w:tc>
           <w:tcPr>
-            <w:tcW w:w="1620" w:type="dxa"/>
+            <w:tcW w:w="1440" w:type="dxa"/>
             <w:tcBorders>
               <w:top w:val="dotted" w:sz="4" w:space="0" w:color="auto"/>
               <w:bottom w:val="dotted" w:sz="4" w:space="0" w:color="auto"/>
@@ -1171,7 +1171,7 @@
                 <w:szCs w:val="20"/>
                 <w:lang w:val="vi-VN"/>
               </w:rPr>
-              <w:t xml:space="preserve"> C/c</w:t>
+              <w:t xml:space="preserve"> </w:t>
             </w:r>
           </w:p>
         </w:tc>
@@ -1213,7 +1213,7 @@
         </w:tc>
         <w:tc>
           <w:tcPr>
-            <w:tcW w:w="1325" w:type="dxa"/>
+            <w:tcW w:w="1440" w:type="dxa"/>
             <w:tcBorders>
               <w:top w:val="dotted" w:sz="4" w:space="0" w:color="auto"/>
               <w:bottom w:val="dotted" w:sz="4" w:space="0" w:color="auto"/>
@@ -1249,7 +1249,7 @@
         </w:tc>
         <w:tc>
           <w:tcPr>
-            <w:tcW w:w="2545" w:type="dxa"/>
+            <w:tcW w:w="2610" w:type="dxa"/>
             <w:tcBorders>
               <w:top w:val="dotted" w:sz="4" w:space="0" w:color="auto"/>
               <w:left w:val="nil"/>
@@ -1299,12 +1299,12 @@
       <w:tr>
         <w:trPr>
           <w:gridAfter w:val="1"/>
-          <w:wAfter w:w="99" w:type="dxa"/>
+          <w:wAfter w:w="105" w:type="dxa"/>
           <w:trHeight w:val="350"/>
         </w:trPr>
         <w:tc>
           <w:tcPr>
-            <w:tcW w:w="1620" w:type="dxa"/>
+            <w:tcW w:w="1440" w:type="dxa"/>
             <w:tcBorders>
               <w:top w:val="dotted" w:sz="4" w:space="0" w:color="auto"/>
               <w:bottom w:val="dotted" w:sz="4" w:space="0" w:color="auto"/>
@@ -1375,7 +1375,7 @@
         </w:tc>
         <w:tc>
           <w:tcPr>
-            <w:tcW w:w="1325" w:type="dxa"/>
+            <w:tcW w:w="1440" w:type="dxa"/>
             <w:tcBorders>
               <w:top w:val="dotted" w:sz="4" w:space="0" w:color="auto"/>
               <w:bottom w:val="dotted" w:sz="4" w:space="0" w:color="auto"/>
@@ -1411,7 +1411,7 @@
         </w:tc>
         <w:tc>
           <w:tcPr>
-            <w:tcW w:w="2545" w:type="dxa"/>
+            <w:tcW w:w="2610" w:type="dxa"/>
             <w:tcBorders>
               <w:top w:val="dotted" w:sz="4" w:space="0" w:color="auto"/>
               <w:left w:val="nil"/>
@@ -1466,16 +1466,18 @@
             </w:r>
           </w:p>
         </w:tc>
+        <w:bookmarkStart w:id="0" w:name="_GoBack"/>
+        <w:bookmarkEnd w:id="0"/>
       </w:tr>
       <w:tr>
         <w:trPr>
           <w:gridAfter w:val="1"/>
-          <w:wAfter w:w="99" w:type="dxa"/>
+          <w:wAfter w:w="105" w:type="dxa"/>
           <w:trHeight w:val="350"/>
         </w:trPr>
         <w:tc>
           <w:tcPr>
-            <w:tcW w:w="1620" w:type="dxa"/>
+            <w:tcW w:w="1440" w:type="dxa"/>
             <w:tcBorders>
               <w:top w:val="dotted" w:sz="4" w:space="0" w:color="auto"/>
               <w:bottom w:val="dotted" w:sz="4" w:space="0" w:color="auto"/>
@@ -1557,7 +1559,7 @@
         </w:tc>
         <w:tc>
           <w:tcPr>
-            <w:tcW w:w="1325" w:type="dxa"/>
+            <w:tcW w:w="1440" w:type="dxa"/>
             <w:tcBorders>
               <w:top w:val="dotted" w:sz="4" w:space="0" w:color="auto"/>
               <w:bottom w:val="dotted" w:sz="4" w:space="0" w:color="auto"/>
@@ -1593,7 +1595,7 @@
         </w:tc>
         <w:tc>
           <w:tcPr>
-            <w:tcW w:w="2545" w:type="dxa"/>
+            <w:tcW w:w="2610" w:type="dxa"/>
             <w:tcBorders>
               <w:top w:val="dotted" w:sz="4" w:space="0" w:color="auto"/>
               <w:left w:val="nil"/>
@@ -1651,12 +1653,12 @@
       <w:tr>
         <w:trPr>
           <w:gridAfter w:val="1"/>
-          <w:wAfter w:w="99" w:type="dxa"/>
+          <w:wAfter w:w="105" w:type="dxa"/>
           <w:trHeight w:val="350"/>
         </w:trPr>
         <w:tc>
           <w:tcPr>
-            <w:tcW w:w="1620" w:type="dxa"/>
+            <w:tcW w:w="1440" w:type="dxa"/>
             <w:tcBorders>
               <w:top w:val="dotted" w:sz="4" w:space="0" w:color="auto"/>
               <w:right w:val="nil"/>
@@ -1735,7 +1737,7 @@
         </w:tc>
         <w:tc>
           <w:tcPr>
-            <w:tcW w:w="1325" w:type="dxa"/>
+            <w:tcW w:w="1440" w:type="dxa"/>
             <w:tcBorders>
               <w:top w:val="dotted" w:sz="4" w:space="0" w:color="auto"/>
               <w:right w:val="nil"/>
@@ -1770,7 +1772,7 @@
         </w:tc>
         <w:tc>
           <w:tcPr>
-            <w:tcW w:w="2545" w:type="dxa"/>
+            <w:tcW w:w="2610" w:type="dxa"/>
             <w:tcBorders>
               <w:top w:val="dotted" w:sz="4" w:space="0" w:color="auto"/>
               <w:left w:val="nil"/>
@@ -1827,7 +1829,7 @@
         </w:trPr>
         <w:tc>
           <w:tcPr>
-            <w:tcW w:w="9999" w:type="dxa"/>
+            <w:tcW w:w="10005" w:type="dxa"/>
             <w:gridSpan w:val="5"/>
           </w:tcPr>
           <w:p>
@@ -2523,7 +2525,7 @@
                 <w:lang w:val="vi-VN"/>
               </w:rPr>
               <w:pict>
-                <v:shape id="_x0000_i1025" type="#_x0000_t75" style="width:119.25pt;height:108pt">
+                <v:shape id="_x0000_i1025" type="#_x0000_t75" style="width:119.6pt;height:108.3pt">
                   <v:imagedata r:id="rId11" o:title="Elide-Fire-Lovingcare" croptop="2220f" cropbottom="4084f"/>
                 </v:shape>
               </w:pict>
@@ -2861,6 +2863,7 @@
           <w:szCs w:val="20"/>
           <w:lang w:val="vi-VN"/>
         </w:rPr>
+        <w:lastRenderedPageBreak/>
         <w:t>Giải thưởng của phòng thương mại công nghiệp tại Cuộc thi Lépine 2018.</w:t>
       </w:r>
     </w:p>
@@ -2989,7 +2992,7 @@
           <w:lang w:val="vi-VN"/>
         </w:rPr>
         <w:pict>
-          <v:shape id="_x0000_i1026" type="#_x0000_t75" style="width:348.75pt;height:162.75pt">
+          <v:shape id="_x0000_i1026" type="#_x0000_t75" style="width:348.75pt;height:162.8pt">
             <v:imagedata r:id="rId12" o:title="6_รางวัลเหรียญทอง__1_"/>
           </v:shape>
         </w:pict>
@@ -3480,7 +3483,7 @@
           <w:lang w:val="vi-VN"/>
         </w:rPr>
         <w:pict>
-          <v:shape id="_x0000_i1027" type="#_x0000_t75" style="width:324pt;height:70.5pt">
+          <v:shape id="_x0000_i1027" type="#_x0000_t75" style="width:323.7pt;height:70.75pt">
             <v:imagedata r:id="rId13" o:title="logo_"/>
           </v:shape>
         </w:pict>
@@ -6560,7 +6563,7 @@
           <w:sz w:val="22"/>
           <w:szCs w:val="22"/>
         </w:rPr>
-        <w:t xml:space="preserve">Công Ty Cổ Phần Kỹ Thuật Môi Trường Tinh Tuệ </w:t>
+        <w:t xml:space="preserve">CÔNG TY CỔ PHẦN KỸ THUẬT MÔI TRƯỜNG TINH TUỆ </w:t>
       </w:r>
     </w:p>
     <w:p>
@@ -6607,7 +6610,7 @@
           <w:sz w:val="22"/>
           <w:szCs w:val="22"/>
         </w:rPr>
-        <w:t>Ngân hàng TMCP Ngoại Thương Việt Nam (VCB) – CN Hùng Vương – TP.HCM</w:t>
+        <w:t>NGÂN HÀNG TMCP NGOẠI THƯƠNG VIỆT NAM (VCB) – CN HÙNG VƯƠNG – TP.HCM</w:t>
       </w:r>
     </w:p>
     <w:p>
@@ -7067,7 +7070,7 @@
     <w:sectPr>
       <w:footerReference w:type="default" r:id="rId14"/>
       <w:pgSz w:w="11909" w:h="16834" w:code="9"/>
-      <w:pgMar w:top="0" w:right="1440" w:bottom="4" w:left="1440" w:header="0" w:footer="0" w:gutter="720"/>
+      <w:pgMar w:top="0" w:right="929" w:bottom="4" w:left="1350" w:header="0" w:footer="0" w:gutter="720"/>
       <w:cols w:space="720"/>
       <w:docGrid w:linePitch="360"/>
     </w:sectPr>
@@ -7076,7 +7079,7 @@
 </file>
 
 <file path=word/endnotes.xml><?xml version="1.0" encoding="utf-8"?>
-<w:endnotes xmlns:wpc="http://schemas.microsoft.com/office/word/2010/wordprocessingCanvas" xmlns:cx="http://schemas.microsoft.com/office/drawing/2014/chartex" xmlns:cx1="http://schemas.microsoft.com/office/drawing/2015/9/8/chartex" xmlns:cx2="http://schemas.microsoft.com/office/drawing/2015/10/21/chartex" xmlns:cx3="http://schemas.microsoft.com/office/drawing/2016/5/9/chartex" xmlns:cx4="http://schemas.microsoft.com/office/drawing/2016/5/10/chartex" xmlns:cx5="http://schemas.microsoft.com/office/drawing/2016/5/11/chartex" xmlns:cx6="http://schemas.microsoft.com/office/drawing/2016/5/12/chartex" xmlns:cx7="http://schemas.microsoft.com/office/drawing/2016/5/13/chartex" xmlns:cx8="http://schemas.microsoft.com/office/drawing/2016/5/14/chartex" xmlns:mc="http://schemas.openxmlformats.org/markup-compatibility/2006" xmlns:aink="http://schemas.microsoft.com/office/drawing/2016/ink" xmlns:am3d="http://schemas.microsoft.com/office/drawing/2017/model3d" xmlns:o="urn:schemas-microsoft-com:office:office" xmlns:r="http://schemas.openxmlformats.org/officeDocument/2006/relationships" xmlns:m="http://schemas.openxmlformats.org/officeDocument/2006/math" xmlns:v="urn:schemas-microsoft-com:vml" xmlns:wp14="http://schemas.microsoft.com/office/word/2010/wordprocessingDrawing" xmlns:wp="http://schemas.openxmlformats.org/drawingml/2006/wordprocessingDrawing" xmlns:w10="urn:schemas-microsoft-com:office:word" xmlns:w="http://schemas.openxmlformats.org/wordprocessingml/2006/main" xmlns:w14="http://schemas.microsoft.com/office/word/2010/wordml" xmlns:w15="http://schemas.microsoft.com/office/word/2012/wordml" xmlns:w16cex="http://schemas.microsoft.com/office/word/2018/wordml/cex" xmlns:w16cid="http://schemas.microsoft.com/office/word/2016/wordml/cid" xmlns:w16="http://schemas.microsoft.com/office/word/2018/wordml" xmlns:w16sdtdh="http://schemas.microsoft.com/office/word/2020/wordml/sdtdatahash" xmlns:w16se="http://schemas.microsoft.com/office/word/2015/wordml/symex" xmlns:wpg="http://schemas.microsoft.com/office/word/2010/wordprocessingGroup" xmlns:wpi="http://schemas.microsoft.com/office/word/2010/wordprocessingInk" xmlns:wne="http://schemas.microsoft.com/office/word/2006/wordml" xmlns:wps="http://schemas.microsoft.com/office/word/2010/wordprocessingShape" mc:Ignorable="w14 w15 w16se w16cid w16 w16cex w16sdtdh wp14">
+<w:endnotes xmlns:wpc="http://schemas.microsoft.com/office/word/2010/wordprocessingCanvas" xmlns:cx="http://schemas.microsoft.com/office/drawing/2014/chartex" xmlns:mc="http://schemas.openxmlformats.org/markup-compatibility/2006" xmlns:o="urn:schemas-microsoft-com:office:office" xmlns:r="http://schemas.openxmlformats.org/officeDocument/2006/relationships" xmlns:m="http://schemas.openxmlformats.org/officeDocument/2006/math" xmlns:v="urn:schemas-microsoft-com:vml" xmlns:wp14="http://schemas.microsoft.com/office/word/2010/wordprocessingDrawing" xmlns:wp="http://schemas.openxmlformats.org/drawingml/2006/wordprocessingDrawing" xmlns:w10="urn:schemas-microsoft-com:office:word" xmlns:w="http://schemas.openxmlformats.org/wordprocessingml/2006/main" xmlns:w14="http://schemas.microsoft.com/office/word/2010/wordml" xmlns:w15="http://schemas.microsoft.com/office/word/2012/wordml" xmlns:w16se="http://schemas.microsoft.com/office/word/2015/wordml/symex" xmlns:wpg="http://schemas.microsoft.com/office/word/2010/wordprocessingGroup" xmlns:wpi="http://schemas.microsoft.com/office/word/2010/wordprocessingInk" xmlns:wne="http://schemas.microsoft.com/office/word/2006/wordml" xmlns:wps="http://schemas.microsoft.com/office/word/2010/wordprocessingShape" mc:Ignorable="w14 w15 w16se wp14">
   <w:endnote w:type="separator" w:id="-1">
     <w:p>
       <w:r>
@@ -7095,7 +7098,7 @@
 </file>
 
 <file path=word/footer1.xml><?xml version="1.0" encoding="utf-8"?>
-<w:ftr xmlns:wpc="http://schemas.microsoft.com/office/word/2010/wordprocessingCanvas" xmlns:cx="http://schemas.microsoft.com/office/drawing/2014/chartex" xmlns:cx1="http://schemas.microsoft.com/office/drawing/2015/9/8/chartex" xmlns:cx2="http://schemas.microsoft.com/office/drawing/2015/10/21/chartex" xmlns:cx3="http://schemas.microsoft.com/office/drawing/2016/5/9/chartex" xmlns:cx4="http://schemas.microsoft.com/office/drawing/2016/5/10/chartex" xmlns:cx5="http://schemas.microsoft.com/office/drawing/2016/5/11/chartex" xmlns:cx6="http://schemas.microsoft.com/office/drawing/2016/5/12/chartex" xmlns:cx7="http://schemas.microsoft.com/office/drawing/2016/5/13/chartex" xmlns:cx8="http://schemas.microsoft.com/office/drawing/2016/5/14/chartex" xmlns:mc="http://schemas.openxmlformats.org/markup-compatibility/2006" xmlns:aink="http://schemas.microsoft.com/office/drawing/2016/ink" xmlns:am3d="http://schemas.microsoft.com/office/drawing/2017/model3d" xmlns:o="urn:schemas-microsoft-com:office:office" xmlns:r="http://schemas.openxmlformats.org/officeDocument/2006/relationships" xmlns:m="http://schemas.openxmlformats.org/officeDocument/2006/math" xmlns:v="urn:schemas-microsoft-com:vml" xmlns:wp14="http://schemas.microsoft.com/office/word/2010/wordprocessingDrawing" xmlns:wp="http://schemas.openxmlformats.org/drawingml/2006/wordprocessingDrawing" xmlns:w10="urn:schemas-microsoft-com:office:word" xmlns:w="http://schemas.openxmlformats.org/wordprocessingml/2006/main" xmlns:w14="http://schemas.microsoft.com/office/word/2010/wordml" xmlns:w15="http://schemas.microsoft.com/office/word/2012/wordml" xmlns:w16cex="http://schemas.microsoft.com/office/word/2018/wordml/cex" xmlns:w16cid="http://schemas.microsoft.com/office/word/2016/wordml/cid" xmlns:w16="http://schemas.microsoft.com/office/word/2018/wordml" xmlns:w16sdtdh="http://schemas.microsoft.com/office/word/2020/wordml/sdtdatahash" xmlns:w16se="http://schemas.microsoft.com/office/word/2015/wordml/symex" xmlns:wpg="http://schemas.microsoft.com/office/word/2010/wordprocessingGroup" xmlns:wpi="http://schemas.microsoft.com/office/word/2010/wordprocessingInk" xmlns:wne="http://schemas.microsoft.com/office/word/2006/wordml" xmlns:wps="http://schemas.microsoft.com/office/word/2010/wordprocessingShape" mc:Ignorable="w14 w15 w16se w16cid w16 w16cex w16sdtdh wp14">
+<w:ftr xmlns:wpc="http://schemas.microsoft.com/office/word/2010/wordprocessingCanvas" xmlns:cx="http://schemas.microsoft.com/office/drawing/2014/chartex" xmlns:mc="http://schemas.openxmlformats.org/markup-compatibility/2006" xmlns:o="urn:schemas-microsoft-com:office:office" xmlns:r="http://schemas.openxmlformats.org/officeDocument/2006/relationships" xmlns:m="http://schemas.openxmlformats.org/officeDocument/2006/math" xmlns:v="urn:schemas-microsoft-com:vml" xmlns:wp14="http://schemas.microsoft.com/office/word/2010/wordprocessingDrawing" xmlns:wp="http://schemas.openxmlformats.org/drawingml/2006/wordprocessingDrawing" xmlns:w10="urn:schemas-microsoft-com:office:word" xmlns:w="http://schemas.openxmlformats.org/wordprocessingml/2006/main" xmlns:w14="http://schemas.microsoft.com/office/word/2010/wordml" xmlns:w15="http://schemas.microsoft.com/office/word/2012/wordml" xmlns:w16se="http://schemas.microsoft.com/office/word/2015/wordml/symex" xmlns:wpg="http://schemas.microsoft.com/office/word/2010/wordprocessingGroup" xmlns:wpi="http://schemas.microsoft.com/office/word/2010/wordprocessingInk" xmlns:wne="http://schemas.microsoft.com/office/word/2006/wordml" xmlns:wps="http://schemas.microsoft.com/office/word/2010/wordprocessingShape" mc:Ignorable="w14 w15 w16se wp14">
   <w:tbl>
     <w:tblPr>
       <w:tblW w:w="9692" w:type="dxa"/>
@@ -7381,7 +7384,7 @@
               <w:szCs w:val="18"/>
               <w:lang w:val="vi-VN" w:eastAsia="vi-VN"/>
             </w:rPr>
-            <w:t>4</w:t>
+            <w:t>1</w:t>
           </w:r>
           <w:r>
             <w:rPr>
@@ -7485,7 +7488,7 @@
 </file>
 
 <file path=word/footnotes.xml><?xml version="1.0" encoding="utf-8"?>
-<w:footnotes xmlns:wpc="http://schemas.microsoft.com/office/word/2010/wordprocessingCanvas" xmlns:cx="http://schemas.microsoft.com/office/drawing/2014/chartex" xmlns:cx1="http://schemas.microsoft.com/office/drawing/2015/9/8/chartex" xmlns:cx2="http://schemas.microsoft.com/office/drawing/2015/10/21/chartex" xmlns:cx3="http://schemas.microsoft.com/office/drawing/2016/5/9/chartex" xmlns:cx4="http://schemas.microsoft.com/office/drawing/2016/5/10/chartex" xmlns:cx5="http://schemas.microsoft.com/office/drawing/2016/5/11/chartex" xmlns:cx6="http://schemas.microsoft.com/office/drawing/2016/5/12/chartex" xmlns:cx7="http://schemas.microsoft.com/office/drawing/2016/5/13/chartex" xmlns:cx8="http://schemas.microsoft.com/office/drawing/2016/5/14/chartex" xmlns:mc="http://schemas.openxmlformats.org/markup-compatibility/2006" xmlns:aink="http://schemas.microsoft.com/office/drawing/2016/ink" xmlns:am3d="http://schemas.microsoft.com/office/drawing/2017/model3d" xmlns:o="urn:schemas-microsoft-com:office:office" xmlns:r="http://schemas.openxmlformats.org/officeDocument/2006/relationships" xmlns:m="http://schemas.openxmlformats.org/officeDocument/2006/math" xmlns:v="urn:schemas-microsoft-com:vml" xmlns:wp14="http://schemas.microsoft.com/office/word/2010/wordprocessingDrawing" xmlns:wp="http://schemas.openxmlformats.org/drawingml/2006/wordprocessingDrawing" xmlns:w10="urn:schemas-microsoft-com:office:word" xmlns:w="http://schemas.openxmlformats.org/wordprocessingml/2006/main" xmlns:w14="http://schemas.microsoft.com/office/word/2010/wordml" xmlns:w15="http://schemas.microsoft.com/office/word/2012/wordml" xmlns:w16cex="http://schemas.microsoft.com/office/word/2018/wordml/cex" xmlns:w16cid="http://schemas.microsoft.com/office/word/2016/wordml/cid" xmlns:w16="http://schemas.microsoft.com/office/word/2018/wordml" xmlns:w16sdtdh="http://schemas.microsoft.com/office/word/2020/wordml/sdtdatahash" xmlns:w16se="http://schemas.microsoft.com/office/word/2015/wordml/symex" xmlns:wpg="http://schemas.microsoft.com/office/word/2010/wordprocessingGroup" xmlns:wpi="http://schemas.microsoft.com/office/word/2010/wordprocessingInk" xmlns:wne="http://schemas.microsoft.com/office/word/2006/wordml" xmlns:wps="http://schemas.microsoft.com/office/word/2010/wordprocessingShape" mc:Ignorable="w14 w15 w16se w16cid w16 w16cex w16sdtdh wp14">
+<w:footnotes xmlns:wpc="http://schemas.microsoft.com/office/word/2010/wordprocessingCanvas" xmlns:cx="http://schemas.microsoft.com/office/drawing/2014/chartex" xmlns:mc="http://schemas.openxmlformats.org/markup-compatibility/2006" xmlns:o="urn:schemas-microsoft-com:office:office" xmlns:r="http://schemas.openxmlformats.org/officeDocument/2006/relationships" xmlns:m="http://schemas.openxmlformats.org/officeDocument/2006/math" xmlns:v="urn:schemas-microsoft-com:vml" xmlns:wp14="http://schemas.microsoft.com/office/word/2010/wordprocessingDrawing" xmlns:wp="http://schemas.openxmlformats.org/drawingml/2006/wordprocessingDrawing" xmlns:w10="urn:schemas-microsoft-com:office:word" xmlns:w="http://schemas.openxmlformats.org/wordprocessingml/2006/main" xmlns:w14="http://schemas.microsoft.com/office/word/2010/wordml" xmlns:w15="http://schemas.microsoft.com/office/word/2012/wordml" xmlns:w16se="http://schemas.microsoft.com/office/word/2015/wordml/symex" xmlns:wpg="http://schemas.microsoft.com/office/word/2010/wordprocessingGroup" xmlns:wpi="http://schemas.microsoft.com/office/word/2010/wordprocessingInk" xmlns:wne="http://schemas.microsoft.com/office/word/2006/wordml" xmlns:wps="http://schemas.microsoft.com/office/word/2010/wordprocessingShape" mc:Ignorable="w14 w15 w16se wp14">
   <w:footnote w:type="separator" w:id="-1">
     <w:p>
       <w:r>
@@ -7504,7 +7507,7 @@
 </file>
 
 <file path=word/numbering.xml><?xml version="1.0" encoding="utf-8"?>
-<w:numbering xmlns:wpc="http://schemas.microsoft.com/office/word/2010/wordprocessingCanvas" xmlns:cx="http://schemas.microsoft.com/office/drawing/2014/chartex" xmlns:cx1="http://schemas.microsoft.com/office/drawing/2015/9/8/chartex" xmlns:cx2="http://schemas.microsoft.com/office/drawing/2015/10/21/chartex" xmlns:cx3="http://schemas.microsoft.com/office/drawing/2016/5/9/chartex" xmlns:cx4="http://schemas.microsoft.com/office/drawing/2016/5/10/chartex" xmlns:cx5="http://schemas.microsoft.com/office/drawing/2016/5/11/chartex" xmlns:cx6="http://schemas.microsoft.com/office/drawing/2016/5/12/chartex" xmlns:cx7="http://schemas.microsoft.com/office/drawing/2016/5/13/chartex" xmlns:cx8="http://schemas.microsoft.com/office/drawing/2016/5/14/chartex" xmlns:mc="http://schemas.openxmlformats.org/markup-compatibility/2006" xmlns:aink="http://schemas.microsoft.com/office/drawing/2016/ink" xmlns:am3d="http://schemas.microsoft.com/office/drawing/2017/model3d" xmlns:o="urn:schemas-microsoft-com:office:office" xmlns:r="http://schemas.openxmlformats.org/officeDocument/2006/relationships" xmlns:m="http://schemas.openxmlformats.org/officeDocument/2006/math" xmlns:v="urn:schemas-microsoft-com:vml" xmlns:wp14="http://schemas.microsoft.com/office/word/2010/wordprocessingDrawing" xmlns:wp="http://schemas.openxmlformats.org/drawingml/2006/wordprocessingDrawing" xmlns:w10="urn:schemas-microsoft-com:office:word" xmlns:w="http://schemas.openxmlformats.org/wordprocessingml/2006/main" xmlns:w14="http://schemas.microsoft.com/office/word/2010/wordml" xmlns:w15="http://schemas.microsoft.com/office/word/2012/wordml" xmlns:w16cex="http://schemas.microsoft.com/office/word/2018/wordml/cex" xmlns:w16cid="http://schemas.microsoft.com/office/word/2016/wordml/cid" xmlns:w16="http://schemas.microsoft.com/office/word/2018/wordml" xmlns:w16sdtdh="http://schemas.microsoft.com/office/word/2020/wordml/sdtdatahash" xmlns:w16se="http://schemas.microsoft.com/office/word/2015/wordml/symex" xmlns:wpg="http://schemas.microsoft.com/office/word/2010/wordprocessingGroup" xmlns:wpi="http://schemas.microsoft.com/office/word/2010/wordprocessingInk" xmlns:wne="http://schemas.microsoft.com/office/word/2006/wordml" xmlns:wps="http://schemas.microsoft.com/office/word/2010/wordprocessingShape" mc:Ignorable="w14 w15 w16se w16cid w16 w16cex w16sdtdh wp14">
+<w:numbering xmlns:wpc="http://schemas.microsoft.com/office/word/2010/wordprocessingCanvas" xmlns:cx="http://schemas.microsoft.com/office/drawing/2014/chartex" xmlns:mc="http://schemas.openxmlformats.org/markup-compatibility/2006" xmlns:o="urn:schemas-microsoft-com:office:office" xmlns:r="http://schemas.openxmlformats.org/officeDocument/2006/relationships" xmlns:m="http://schemas.openxmlformats.org/officeDocument/2006/math" xmlns:v="urn:schemas-microsoft-com:vml" xmlns:wp14="http://schemas.microsoft.com/office/word/2010/wordprocessingDrawing" xmlns:wp="http://schemas.openxmlformats.org/drawingml/2006/wordprocessingDrawing" xmlns:w10="urn:schemas-microsoft-com:office:word" xmlns:w="http://schemas.openxmlformats.org/wordprocessingml/2006/main" xmlns:w14="http://schemas.microsoft.com/office/word/2010/wordml" xmlns:w15="http://schemas.microsoft.com/office/word/2012/wordml" xmlns:w16se="http://schemas.microsoft.com/office/word/2015/wordml/symex" xmlns:wpg="http://schemas.microsoft.com/office/word/2010/wordprocessingGroup" xmlns:wpi="http://schemas.microsoft.com/office/word/2010/wordprocessingInk" xmlns:wne="http://schemas.microsoft.com/office/word/2006/wordml" xmlns:wps="http://schemas.microsoft.com/office/word/2010/wordprocessingShape" mc:Ignorable="w14 w15 w16se wp14">
   <w:abstractNum w:abstractNumId="0" w15:restartNumberingAfterBreak="0">
     <w:nsid w:val="06A804C1"/>
     <w:multiLevelType w:val="hybridMultilevel"/>
@@ -10064,15 +10067,6 @@
   </w:num>
   <w:num w:numId="12">
     <w:abstractNumId w:val="9"/>
-    <w:lvlOverride w:ilvl="0"/>
-    <w:lvlOverride w:ilvl="1"/>
-    <w:lvlOverride w:ilvl="2"/>
-    <w:lvlOverride w:ilvl="3"/>
-    <w:lvlOverride w:ilvl="4"/>
-    <w:lvlOverride w:ilvl="5"/>
-    <w:lvlOverride w:ilvl="6"/>
-    <w:lvlOverride w:ilvl="7"/>
-    <w:lvlOverride w:ilvl="8"/>
   </w:num>
   <w:num w:numId="13">
     <w:abstractNumId w:val="9"/>
@@ -10185,7 +10179,7 @@
 </file>
 
 <file path=word/styles.xml><?xml version="1.0" encoding="utf-8"?>
-<w:styles xmlns:mc="http://schemas.openxmlformats.org/markup-compatibility/2006" xmlns:r="http://schemas.openxmlformats.org/officeDocument/2006/relationships" xmlns:w="http://schemas.openxmlformats.org/wordprocessingml/2006/main" xmlns:w14="http://schemas.microsoft.com/office/word/2010/wordml" xmlns:w15="http://schemas.microsoft.com/office/word/2012/wordml" xmlns:w16cex="http://schemas.microsoft.com/office/word/2018/wordml/cex" xmlns:w16cid="http://schemas.microsoft.com/office/word/2016/wordml/cid" xmlns:w16="http://schemas.microsoft.com/office/word/2018/wordml" xmlns:w16sdtdh="http://schemas.microsoft.com/office/word/2020/wordml/sdtdatahash" xmlns:w16se="http://schemas.microsoft.com/office/word/2015/wordml/symex" mc:Ignorable="w14 w15 w16se w16cid w16 w16cex w16sdtdh">
+<w:styles xmlns:mc="http://schemas.openxmlformats.org/markup-compatibility/2006" xmlns:r="http://schemas.openxmlformats.org/officeDocument/2006/relationships" xmlns:w="http://schemas.openxmlformats.org/wordprocessingml/2006/main" xmlns:w14="http://schemas.microsoft.com/office/word/2010/wordml" xmlns:w15="http://schemas.microsoft.com/office/word/2012/wordml" xmlns:w16se="http://schemas.microsoft.com/office/word/2015/wordml/symex" mc:Ignorable="w14 w15 w16se">
   <w:docDefaults>
     <w:rPrDefault>
       <w:rPr>
@@ -10195,7 +10189,7 @@
     </w:rPrDefault>
     <w:pPrDefault/>
   </w:docDefaults>
-  <w:latentStyles w:defLockedState="0" w:defUIPriority="0" w:defSemiHidden="0" w:defUnhideWhenUsed="0" w:defQFormat="0" w:count="376">
+  <w:latentStyles w:defLockedState="0" w:defUIPriority="0" w:defSemiHidden="0" w:defUnhideWhenUsed="0" w:defQFormat="0" w:count="371">
     <w:lsdException w:name="Normal" w:qFormat="1"/>
     <w:lsdException w:name="heading 1" w:qFormat="1"/>
     <w:lsdException w:name="heading 2" w:semiHidden="1" w:unhideWhenUsed="1" w:qFormat="1"/>
@@ -10213,7 +10207,51 @@
     <w:lsdException w:name="FollowedHyperlink" w:uiPriority="99"/>
     <w:lsdException w:name="Strong" w:uiPriority="22" w:qFormat="1"/>
     <w:lsdException w:name="Emphasis" w:qFormat="1"/>
+    <w:lsdException w:name="Normal Table" w:semiHidden="1" w:unhideWhenUsed="1"/>
     <w:lsdException w:name="No List" w:uiPriority="99"/>
+    <w:lsdException w:name="Table Simple 1" w:semiHidden="1" w:unhideWhenUsed="1"/>
+    <w:lsdException w:name="Table Simple 2" w:semiHidden="1" w:unhideWhenUsed="1"/>
+    <w:lsdException w:name="Table Simple 3" w:semiHidden="1" w:unhideWhenUsed="1"/>
+    <w:lsdException w:name="Table Classic 1" w:semiHidden="1" w:unhideWhenUsed="1"/>
+    <w:lsdException w:name="Table Classic 2" w:semiHidden="1" w:unhideWhenUsed="1"/>
+    <w:lsdException w:name="Table Classic 3" w:semiHidden="1" w:unhideWhenUsed="1"/>
+    <w:lsdException w:name="Table Classic 4" w:semiHidden="1" w:unhideWhenUsed="1"/>
+    <w:lsdException w:name="Table Colorful 1" w:semiHidden="1" w:unhideWhenUsed="1"/>
+    <w:lsdException w:name="Table Colorful 2" w:semiHidden="1" w:unhideWhenUsed="1"/>
+    <w:lsdException w:name="Table Colorful 3" w:semiHidden="1" w:unhideWhenUsed="1"/>
+    <w:lsdException w:name="Table Columns 1" w:semiHidden="1" w:unhideWhenUsed="1"/>
+    <w:lsdException w:name="Table Columns 2" w:semiHidden="1" w:unhideWhenUsed="1"/>
+    <w:lsdException w:name="Table Columns 3" w:semiHidden="1" w:unhideWhenUsed="1"/>
+    <w:lsdException w:name="Table Columns 4" w:semiHidden="1" w:unhideWhenUsed="1"/>
+    <w:lsdException w:name="Table Columns 5" w:semiHidden="1" w:unhideWhenUsed="1"/>
+    <w:lsdException w:name="Table Grid 1" w:semiHidden="1" w:unhideWhenUsed="1"/>
+    <w:lsdException w:name="Table Grid 2" w:semiHidden="1" w:unhideWhenUsed="1"/>
+    <w:lsdException w:name="Table Grid 3" w:semiHidden="1" w:unhideWhenUsed="1"/>
+    <w:lsdException w:name="Table Grid 4" w:semiHidden="1" w:unhideWhenUsed="1"/>
+    <w:lsdException w:name="Table Grid 5" w:semiHidden="1" w:unhideWhenUsed="1"/>
+    <w:lsdException w:name="Table Grid 6" w:semiHidden="1" w:unhideWhenUsed="1"/>
+    <w:lsdException w:name="Table Grid 7" w:semiHidden="1" w:unhideWhenUsed="1"/>
+    <w:lsdException w:name="Table Grid 8" w:semiHidden="1" w:unhideWhenUsed="1"/>
+    <w:lsdException w:name="Table List 1" w:semiHidden="1" w:unhideWhenUsed="1"/>
+    <w:lsdException w:name="Table List 2" w:semiHidden="1" w:unhideWhenUsed="1"/>
+    <w:lsdException w:name="Table List 3" w:semiHidden="1" w:unhideWhenUsed="1"/>
+    <w:lsdException w:name="Table List 4" w:semiHidden="1" w:unhideWhenUsed="1"/>
+    <w:lsdException w:name="Table List 5" w:semiHidden="1" w:unhideWhenUsed="1"/>
+    <w:lsdException w:name="Table List 6" w:semiHidden="1" w:unhideWhenUsed="1"/>
+    <w:lsdException w:name="Table List 7" w:semiHidden="1" w:unhideWhenUsed="1"/>
+    <w:lsdException w:name="Table List 8" w:semiHidden="1" w:unhideWhenUsed="1"/>
+    <w:lsdException w:name="Table 3D effects 1" w:semiHidden="1" w:unhideWhenUsed="1"/>
+    <w:lsdException w:name="Table 3D effects 2" w:semiHidden="1" w:unhideWhenUsed="1"/>
+    <w:lsdException w:name="Table 3D effects 3" w:semiHidden="1" w:unhideWhenUsed="1"/>
+    <w:lsdException w:name="Table Contemporary" w:semiHidden="1" w:unhideWhenUsed="1"/>
+    <w:lsdException w:name="Table Elegant" w:semiHidden="1" w:unhideWhenUsed="1"/>
+    <w:lsdException w:name="Table Professional" w:semiHidden="1" w:unhideWhenUsed="1"/>
+    <w:lsdException w:name="Table Subtle 1" w:semiHidden="1" w:unhideWhenUsed="1"/>
+    <w:lsdException w:name="Table Subtle 2" w:semiHidden="1" w:unhideWhenUsed="1"/>
+    <w:lsdException w:name="Table Web 1" w:semiHidden="1" w:unhideWhenUsed="1"/>
+    <w:lsdException w:name="Table Web 2" w:semiHidden="1" w:unhideWhenUsed="1"/>
+    <w:lsdException w:name="Table Web 3" w:semiHidden="1" w:unhideWhenUsed="1"/>
+    <w:lsdException w:name="Table Theme" w:semiHidden="1" w:unhideWhenUsed="1"/>
     <w:lsdException w:name="Placeholder Text" w:semiHidden="1" w:uiPriority="99"/>
     <w:lsdException w:name="No Spacing" w:uiPriority="1" w:qFormat="1"/>
     <w:lsdException w:name="Light Shading" w:uiPriority="60"/>
@@ -10429,11 +10467,6 @@
     <w:lsdException w:name="List Table 5 Dark Accent 6" w:uiPriority="50"/>
     <w:lsdException w:name="List Table 6 Colorful Accent 6" w:uiPriority="51"/>
     <w:lsdException w:name="List Table 7 Colorful Accent 6" w:uiPriority="52"/>
-    <w:lsdException w:name="Mention" w:semiHidden="1" w:uiPriority="99" w:unhideWhenUsed="1"/>
-    <w:lsdException w:name="Smart Hyperlink" w:semiHidden="1" w:uiPriority="99" w:unhideWhenUsed="1"/>
-    <w:lsdException w:name="Hashtag" w:semiHidden="1" w:uiPriority="99" w:unhideWhenUsed="1"/>
-    <w:lsdException w:name="Unresolved Mention" w:semiHidden="1" w:uiPriority="99" w:unhideWhenUsed="1"/>
-    <w:lsdException w:name="Smart Link" w:semiHidden="1" w:uiPriority="99" w:unhideWhenUsed="1"/>
   </w:latentStyles>
   <w:style w:type="paragraph" w:default="1" w:styleId="Normal">
     <w:name w:val="Normal"/>
@@ -10486,11 +10519,15 @@
   </w:style>
   <w:style w:type="character" w:default="1" w:styleId="DefaultParagraphFont">
     <w:name w:val="Default Paragraph Font"/>
+    <w:uiPriority w:val="1"/>
     <w:semiHidden/>
+    <w:unhideWhenUsed/>
   </w:style>
   <w:style w:type="table" w:default="1" w:styleId="TableNormal">
     <w:name w:val="Normal Table"/>
+    <w:uiPriority w:val="99"/>
     <w:semiHidden/>
+    <w:unhideWhenUsed/>
     <w:tblPr>
       <w:tblInd w:w="0" w:type="dxa"/>
       <w:tblCellMar>
@@ -10505,6 +10542,7 @@
     <w:name w:val="No List"/>
     <w:uiPriority w:val="99"/>
     <w:semiHidden/>
+    <w:unhideWhenUsed/>
   </w:style>
   <w:style w:type="character" w:customStyle="1" w:styleId="Heading8Char">
     <w:name w:val="Heading 8 Char"/>
@@ -10604,7 +10642,7 @@
     </w:rPr>
   </w:style>
   <w:style w:type="paragraph" w:customStyle="1" w:styleId="CharCharCharChar">
-    <w:name w:val=" Char Char Char Char"/>
+    <w:name w:val="Char Char Char Char"/>
     <w:basedOn w:val="Normal"/>
     <w:rsid w:val="002B655A"/>
     <w:pPr>
@@ -10632,7 +10670,7 @@
     </w:rPr>
   </w:style>
   <w:style w:type="paragraph" w:customStyle="1" w:styleId="CharCharCharCharCharCharChar">
-    <w:name w:val=" Char Char Char Char Char Char Char"/>
+    <w:name w:val="Char Char Char Char Char Char Char"/>
     <w:basedOn w:val="Normal"/>
     <w:rsid w:val="006A2C0F"/>
     <w:pPr>
@@ -10646,7 +10684,7 @@
     </w:rPr>
   </w:style>
   <w:style w:type="paragraph" w:customStyle="1" w:styleId="Char">
-    <w:name w:val=" Char"/>
+    <w:name w:val="Char"/>
     <w:basedOn w:val="Normal"/>
     <w:rsid w:val="00386C8D"/>
     <w:pPr>
@@ -11035,7 +11073,7 @@
 </file>
 
 <file path=customXml/itemProps1.xml><?xml version="1.0" encoding="utf-8"?>
-<ds:datastoreItem xmlns:ds="http://schemas.openxmlformats.org/officeDocument/2006/customXml" ds:itemID="{116C1538-BEC0-4CA3-B02D-67624331B5C3}">
+<ds:datastoreItem xmlns:ds="http://schemas.openxmlformats.org/officeDocument/2006/customXml" ds:itemID="{3594EFB0-A976-4DD3-A2CA-16233783553B}">
   <ds:schemaRefs>
     <ds:schemaRef ds:uri="http://schemas.openxmlformats.org/officeDocument/2006/bibliography"/>
   </ds:schemaRefs>

</xml_diff>

<commit_message>
Embed fonts in quote template to fix LibreOffice spacing issue
Co-Authored-By: Claude Sonnet 4.6 <noreply@anthropic.com>
</commit_message>
<xml_diff>
--- a/templates/quote-template.docx
+++ b/templates/quote-template.docx
@@ -1293,6 +1293,8 @@
               </w:rPr>
               <w:t xml:space="preserve"> </w:t>
             </w:r>
+            <w:bookmarkStart w:id="0" w:name="_GoBack"/>
+            <w:bookmarkEnd w:id="0"/>
           </w:p>
         </w:tc>
       </w:tr>
@@ -1466,8 +1468,6 @@
             </w:r>
           </w:p>
         </w:tc>
-        <w:bookmarkStart w:id="0" w:name="_GoBack"/>
-        <w:bookmarkEnd w:id="0"/>
       </w:tr>
       <w:tr>
         <w:trPr>
@@ -2525,7 +2525,7 @@
                 <w:lang w:val="vi-VN"/>
               </w:rPr>
               <w:pict>
-                <v:shape id="_x0000_i1025" type="#_x0000_t75" style="width:119.6pt;height:108.3pt">
+                <v:shape id="_x0000_i1025" type="#_x0000_t75" style="width:120pt;height:108pt">
                   <v:imagedata r:id="rId11" o:title="Elide-Fire-Lovingcare" croptop="2220f" cropbottom="4084f"/>
                 </v:shape>
               </w:pict>
@@ -2992,7 +2992,7 @@
           <w:lang w:val="vi-VN"/>
         </w:rPr>
         <w:pict>
-          <v:shape id="_x0000_i1026" type="#_x0000_t75" style="width:348.75pt;height:162.8pt">
+          <v:shape id="_x0000_i1026" type="#_x0000_t75" style="width:348.75pt;height:162.75pt">
             <v:imagedata r:id="rId12" o:title="6_รางวัลเหรียญทอง__1_"/>
           </v:shape>
         </w:pict>
@@ -3483,7 +3483,7 @@
           <w:lang w:val="vi-VN"/>
         </w:rPr>
         <w:pict>
-          <v:shape id="_x0000_i1027" type="#_x0000_t75" style="width:323.7pt;height:70.75pt">
+          <v:shape id="_x0000_i1027" type="#_x0000_t75" style="width:324pt;height:70.5pt">
             <v:imagedata r:id="rId13" o:title="logo_"/>
           </v:shape>
         </w:pict>
@@ -7384,7 +7384,7 @@
               <w:szCs w:val="18"/>
               <w:lang w:val="vi-VN" w:eastAsia="vi-VN"/>
             </w:rPr>
-            <w:t>1</w:t>
+            <w:t>4</w:t>
           </w:r>
           <w:r>
             <w:rPr>
@@ -11073,7 +11073,7 @@
 </file>
 
 <file path=customXml/itemProps1.xml><?xml version="1.0" encoding="utf-8"?>
-<ds:datastoreItem xmlns:ds="http://schemas.openxmlformats.org/officeDocument/2006/customXml" ds:itemID="{3594EFB0-A976-4DD3-A2CA-16233783553B}">
+<ds:datastoreItem xmlns:ds="http://schemas.openxmlformats.org/officeDocument/2006/customXml" ds:itemID="{92B3D890-0C4C-4421-A7B6-546FC2803A2F}">
   <ds:schemaRefs>
     <ds:schemaRef ds:uri="http://schemas.openxmlformats.org/officeDocument/2006/bibliography"/>
   </ds:schemaRefs>

</xml_diff>

<commit_message>
feat: Design System, bảo mật env vars, NV hợp đồng, template v2
- Tạo public/design-system.css — CSS token cho toàn app (màu, font, spacing, radius, shadow)
- Áp dụng Design System vào index.html — xóa toàn bộ hardcode, dùng CSS variables
- Thêm express.static('public') để serve design-system.css và các static files
- Chuyển NOCODB_BASE, TABLE_NV/BG/SP sang process.env (bảo mật)
- Thêm .env.example, cập nhật .gitignore (ignore outputs/, *.pdf, *.docx)
- Fix deSpliceFields: xử lý {{field}} bị Word cắt thành nhiều XML runs
- Thêm block Nhân viên phụ trách vào form hợp đồng
- Cập nhật quote-template.docx và contract-template.docx lên v2

Co-Authored-By: Claude Sonnet 4.6 <noreply@anthropic.com>
</commit_message>
<xml_diff>
--- a/templates/quote-template.docx
+++ b/templates/quote-template.docx
@@ -167,7 +167,7 @@
     </w:p>
     <w:tbl>
       <w:tblPr>
-        <w:tblW w:w="10005" w:type="dxa"/>
+        <w:tblW w:w="10095" w:type="dxa"/>
         <w:tblInd w:w="-252" w:type="dxa"/>
         <w:tblBorders>
           <w:top w:val="single" w:sz="4" w:space="0" w:color="auto"/>
@@ -180,9 +180,9 @@
       </w:tblPr>
       <w:tblGrid>
         <w:gridCol w:w="1440"/>
-        <w:gridCol w:w="4410"/>
-        <w:gridCol w:w="1440"/>
-        <w:gridCol w:w="2610"/>
+        <w:gridCol w:w="3870"/>
+        <w:gridCol w:w="1350"/>
+        <w:gridCol w:w="3330"/>
         <w:gridCol w:w="105"/>
       </w:tblGrid>
       <w:tr>
@@ -225,7 +225,7 @@
         </w:tc>
         <w:tc>
           <w:tcPr>
-            <w:tcW w:w="4410" w:type="dxa"/>
+            <w:tcW w:w="3870" w:type="dxa"/>
             <w:tcBorders>
               <w:left w:val="nil"/>
               <w:bottom w:val="dotted" w:sz="4" w:space="0" w:color="auto"/>
@@ -272,27 +272,17 @@
                 <w:szCs w:val="20"/>
                 <w:lang w:val="vi-VN"/>
               </w:rPr>
-              <w:t xml:space="preserve">Công ty CP Kỹ </w:t>
-            </w:r>
-            <w:r>
-              <w:rPr>
-                <w:rFonts w:ascii="Tahoma" w:hAnsi="Tahoma" w:cs="Tahoma"/>
-                <w:noProof/>
-                <w:sz w:val="20"/>
-                <w:szCs w:val="20"/>
-                <w:lang w:val="vi-VN"/>
-              </w:rPr>
-              <w:t>T</w:t>
-            </w:r>
-            <w:r>
-              <w:rPr>
-                <w:rFonts w:ascii="Tahoma" w:hAnsi="Tahoma" w:cs="Tahoma"/>
-                <w:noProof/>
-                <w:sz w:val="20"/>
-                <w:szCs w:val="20"/>
-                <w:lang w:val="vi-VN"/>
-              </w:rPr>
-              <w:t xml:space="preserve">huật Môi </w:t>
+              <w:t>Công ty CP KT</w:t>
+            </w:r>
+            <w:r>
+              <w:rPr>
+                <w:rFonts w:ascii="Tahoma" w:hAnsi="Tahoma" w:cs="Tahoma"/>
+                <w:noProof/>
+                <w:sz w:val="20"/>
+                <w:szCs w:val="20"/>
+                <w:lang w:val="vi-VN"/>
+              </w:rPr>
+              <w:t xml:space="preserve"> Môi </w:t>
             </w:r>
             <w:r>
               <w:rPr>
@@ -318,7 +308,7 @@
         </w:tc>
         <w:tc>
           <w:tcPr>
-            <w:tcW w:w="1440" w:type="dxa"/>
+            <w:tcW w:w="1350" w:type="dxa"/>
             <w:tcBorders>
               <w:bottom w:val="dotted" w:sz="4" w:space="0" w:color="auto"/>
               <w:right w:val="nil"/>
@@ -351,7 +341,7 @@
         </w:tc>
         <w:tc>
           <w:tcPr>
-            <w:tcW w:w="2610" w:type="dxa"/>
+            <w:tcW w:w="3330" w:type="dxa"/>
             <w:tcBorders>
               <w:left w:val="nil"/>
               <w:bottom w:val="dotted" w:sz="4" w:space="0" w:color="auto"/>
@@ -383,12 +373,29 @@
             <w:r>
               <w:rPr>
                 <w:rFonts w:ascii="Tahoma" w:hAnsi="Tahoma" w:cs="Tahoma"/>
-                <w:b w:val="0"/>
-                <w:noProof/>
-                <w:sz w:val="20"/>
-                <w:szCs w:val="20"/>
-              </w:rPr>
-              <w:t>{d.ten_cong_ty}</w:t>
+                <w:noProof/>
+                <w:sz w:val="20"/>
+                <w:szCs w:val="20"/>
+              </w:rPr>
+              <w:t>{{T</w:t>
+            </w:r>
+            <w:r>
+              <w:rPr>
+                <w:rFonts w:ascii="Tahoma" w:hAnsi="Tahoma" w:cs="Tahoma"/>
+                <w:noProof/>
+                <w:sz w:val="20"/>
+                <w:szCs w:val="20"/>
+              </w:rPr>
+              <w:t>en_cong_ty}</w:t>
+            </w:r>
+            <w:r>
+              <w:rPr>
+                <w:rFonts w:ascii="Tahoma" w:hAnsi="Tahoma" w:cs="Tahoma"/>
+                <w:noProof/>
+                <w:sz w:val="20"/>
+                <w:szCs w:val="20"/>
+              </w:rPr>
+              <w:t>}</w:t>
             </w:r>
           </w:p>
         </w:tc>
@@ -436,7 +443,7 @@
         </w:tc>
         <w:tc>
           <w:tcPr>
-            <w:tcW w:w="4410" w:type="dxa"/>
+            <w:tcW w:w="3870" w:type="dxa"/>
             <w:tcBorders>
               <w:top w:val="dotted" w:sz="4" w:space="0" w:color="auto"/>
               <w:left w:val="nil"/>
@@ -493,7 +500,7 @@
         </w:tc>
         <w:tc>
           <w:tcPr>
-            <w:tcW w:w="1440" w:type="dxa"/>
+            <w:tcW w:w="1350" w:type="dxa"/>
             <w:tcBorders>
               <w:top w:val="dotted" w:sz="4" w:space="0" w:color="auto"/>
               <w:bottom w:val="dotted" w:sz="4" w:space="0" w:color="auto"/>
@@ -529,7 +536,7 @@
         </w:tc>
         <w:tc>
           <w:tcPr>
-            <w:tcW w:w="2610" w:type="dxa"/>
+            <w:tcW w:w="3330" w:type="dxa"/>
             <w:tcBorders>
               <w:top w:val="dotted" w:sz="4" w:space="0" w:color="auto"/>
               <w:left w:val="nil"/>
@@ -629,7 +636,7 @@
         </w:tc>
         <w:tc>
           <w:tcPr>
-            <w:tcW w:w="4410" w:type="dxa"/>
+            <w:tcW w:w="3870" w:type="dxa"/>
             <w:tcBorders>
               <w:top w:val="dotted" w:sz="4" w:space="0" w:color="auto"/>
               <w:left w:val="nil"/>
@@ -684,7 +691,7 @@
         </w:tc>
         <w:tc>
           <w:tcPr>
-            <w:tcW w:w="1440" w:type="dxa"/>
+            <w:tcW w:w="1350" w:type="dxa"/>
             <w:tcBorders>
               <w:top w:val="dotted" w:sz="4" w:space="0" w:color="auto"/>
               <w:bottom w:val="dotted" w:sz="4" w:space="0" w:color="auto"/>
@@ -720,7 +727,7 @@
         </w:tc>
         <w:tc>
           <w:tcPr>
-            <w:tcW w:w="2610" w:type="dxa"/>
+            <w:tcW w:w="3330" w:type="dxa"/>
             <w:tcBorders>
               <w:top w:val="dotted" w:sz="4" w:space="0" w:color="auto"/>
               <w:left w:val="nil"/>
@@ -808,7 +815,7 @@
         </w:tc>
         <w:tc>
           <w:tcPr>
-            <w:tcW w:w="4410" w:type="dxa"/>
+            <w:tcW w:w="3870" w:type="dxa"/>
             <w:tcBorders>
               <w:top w:val="dotted" w:sz="4" w:space="0" w:color="auto"/>
               <w:left w:val="nil"/>
@@ -864,7 +871,7 @@
         </w:tc>
         <w:tc>
           <w:tcPr>
-            <w:tcW w:w="1440" w:type="dxa"/>
+            <w:tcW w:w="1350" w:type="dxa"/>
             <w:tcBorders>
               <w:top w:val="dotted" w:sz="4" w:space="0" w:color="auto"/>
               <w:bottom w:val="dotted" w:sz="4" w:space="0" w:color="auto"/>
@@ -900,7 +907,7 @@
         </w:tc>
         <w:tc>
           <w:tcPr>
-            <w:tcW w:w="2610" w:type="dxa"/>
+            <w:tcW w:w="3330" w:type="dxa"/>
             <w:tcBorders>
               <w:top w:val="dotted" w:sz="4" w:space="0" w:color="auto"/>
               <w:left w:val="nil"/>
@@ -1000,7 +1007,7 @@
         </w:tc>
         <w:tc>
           <w:tcPr>
-            <w:tcW w:w="4410" w:type="dxa"/>
+            <w:tcW w:w="3870" w:type="dxa"/>
             <w:tcBorders>
               <w:top w:val="dotted" w:sz="4" w:space="0" w:color="auto"/>
               <w:left w:val="nil"/>
@@ -1056,7 +1063,7 @@
         </w:tc>
         <w:tc>
           <w:tcPr>
-            <w:tcW w:w="1440" w:type="dxa"/>
+            <w:tcW w:w="1350" w:type="dxa"/>
             <w:tcBorders>
               <w:top w:val="dotted" w:sz="4" w:space="0" w:color="auto"/>
               <w:bottom w:val="dotted" w:sz="4" w:space="0" w:color="auto"/>
@@ -1092,7 +1099,7 @@
         </w:tc>
         <w:tc>
           <w:tcPr>
-            <w:tcW w:w="2610" w:type="dxa"/>
+            <w:tcW w:w="3330" w:type="dxa"/>
             <w:tcBorders>
               <w:top w:val="dotted" w:sz="4" w:space="0" w:color="auto"/>
               <w:left w:val="nil"/>
@@ -1213,7 +1220,7 @@
         </w:tc>
         <w:tc>
           <w:tcPr>
-            <w:tcW w:w="4410" w:type="dxa"/>
+            <w:tcW w:w="3870" w:type="dxa"/>
             <w:tcBorders>
               <w:top w:val="dotted" w:sz="4" w:space="0" w:color="auto"/>
               <w:left w:val="nil"/>
@@ -1249,7 +1256,7 @@
         </w:tc>
         <w:tc>
           <w:tcPr>
-            <w:tcW w:w="1440" w:type="dxa"/>
+            <w:tcW w:w="1350" w:type="dxa"/>
             <w:tcBorders>
               <w:top w:val="dotted" w:sz="4" w:space="0" w:color="auto"/>
               <w:bottom w:val="dotted" w:sz="4" w:space="0" w:color="auto"/>
@@ -1285,7 +1292,7 @@
         </w:tc>
         <w:tc>
           <w:tcPr>
-            <w:tcW w:w="2610" w:type="dxa"/>
+            <w:tcW w:w="3330" w:type="dxa"/>
             <w:tcBorders>
               <w:top w:val="dotted" w:sz="4" w:space="0" w:color="auto"/>
               <w:left w:val="nil"/>
@@ -1375,7 +1382,7 @@
         </w:tc>
         <w:tc>
           <w:tcPr>
-            <w:tcW w:w="4410" w:type="dxa"/>
+            <w:tcW w:w="3870" w:type="dxa"/>
             <w:tcBorders>
               <w:top w:val="dotted" w:sz="4" w:space="0" w:color="auto"/>
               <w:left w:val="nil"/>
@@ -1411,7 +1418,7 @@
         </w:tc>
         <w:tc>
           <w:tcPr>
-            <w:tcW w:w="1440" w:type="dxa"/>
+            <w:tcW w:w="1350" w:type="dxa"/>
             <w:tcBorders>
               <w:top w:val="dotted" w:sz="4" w:space="0" w:color="auto"/>
               <w:bottom w:val="dotted" w:sz="4" w:space="0" w:color="auto"/>
@@ -1447,7 +1454,7 @@
         </w:tc>
         <w:tc>
           <w:tcPr>
-            <w:tcW w:w="2610" w:type="dxa"/>
+            <w:tcW w:w="3330" w:type="dxa"/>
             <w:tcBorders>
               <w:top w:val="dotted" w:sz="4" w:space="0" w:color="auto"/>
               <w:left w:val="nil"/>
@@ -1546,7 +1553,7 @@
         </w:tc>
         <w:tc>
           <w:tcPr>
-            <w:tcW w:w="4410" w:type="dxa"/>
+            <w:tcW w:w="3870" w:type="dxa"/>
             <w:tcBorders>
               <w:top w:val="dotted" w:sz="4" w:space="0" w:color="auto"/>
               <w:left w:val="nil"/>
@@ -1593,7 +1600,7 @@
         </w:tc>
         <w:tc>
           <w:tcPr>
-            <w:tcW w:w="1440" w:type="dxa"/>
+            <w:tcW w:w="1350" w:type="dxa"/>
             <w:tcBorders>
               <w:top w:val="dotted" w:sz="4" w:space="0" w:color="auto"/>
               <w:bottom w:val="dotted" w:sz="4" w:space="0" w:color="auto"/>
@@ -1629,7 +1636,7 @@
         </w:tc>
         <w:tc>
           <w:tcPr>
-            <w:tcW w:w="2610" w:type="dxa"/>
+            <w:tcW w:w="3330" w:type="dxa"/>
             <w:tcBorders>
               <w:top w:val="dotted" w:sz="4" w:space="0" w:color="auto"/>
               <w:left w:val="nil"/>
@@ -1726,7 +1733,7 @@
         </w:tc>
         <w:tc>
           <w:tcPr>
-            <w:tcW w:w="4410" w:type="dxa"/>
+            <w:tcW w:w="3870" w:type="dxa"/>
             <w:tcBorders>
               <w:top w:val="dotted" w:sz="4" w:space="0" w:color="auto"/>
               <w:left w:val="nil"/>
@@ -1771,7 +1778,7 @@
         </w:tc>
         <w:tc>
           <w:tcPr>
-            <w:tcW w:w="1440" w:type="dxa"/>
+            <w:tcW w:w="1350" w:type="dxa"/>
             <w:tcBorders>
               <w:top w:val="dotted" w:sz="4" w:space="0" w:color="auto"/>
               <w:right w:val="nil"/>
@@ -1806,7 +1813,7 @@
         </w:tc>
         <w:tc>
           <w:tcPr>
-            <w:tcW w:w="2610" w:type="dxa"/>
+            <w:tcW w:w="3330" w:type="dxa"/>
             <w:tcBorders>
               <w:top w:val="dotted" w:sz="4" w:space="0" w:color="auto"/>
               <w:left w:val="nil"/>
@@ -1863,7 +1870,7 @@
         </w:trPr>
         <w:tc>
           <w:tcPr>
-            <w:tcW w:w="10005" w:type="dxa"/>
+            <w:tcW w:w="10095" w:type="dxa"/>
             <w:gridSpan w:val="5"/>
           </w:tcPr>
           <w:p>
@@ -2559,7 +2566,7 @@
                 <w:lang w:val="vi-VN"/>
               </w:rPr>
               <w:pict>
-                <v:shape id="_x0000_i1025" type="#_x0000_t75" style="width:119.6pt;height:108.3pt">
+                <v:shape id="_x0000_i1025" type="#_x0000_t75" style="width:120pt;height:108pt">
                   <v:imagedata r:id="rId11" o:title="Elide-Fire-Lovingcare" croptop="2220f" cropbottom="4084f"/>
                 </v:shape>
               </w:pict>
@@ -3026,7 +3033,7 @@
           <w:lang w:val="vi-VN"/>
         </w:rPr>
         <w:pict>
-          <v:shape id="_x0000_i1026" type="#_x0000_t75" style="width:348.75pt;height:162.8pt">
+          <v:shape id="_x0000_i1026" type="#_x0000_t75" style="width:348.75pt;height:162.75pt">
             <v:imagedata r:id="rId12" o:title="6_รางวัลเหรียญทอง__1_"/>
           </v:shape>
         </w:pict>
@@ -3517,7 +3524,7 @@
           <w:lang w:val="vi-VN"/>
         </w:rPr>
         <w:pict>
-          <v:shape id="_x0000_i1027" type="#_x0000_t75" style="width:323.7pt;height:70.75pt">
+          <v:shape id="_x0000_i1027" type="#_x0000_t75" style="width:324pt;height:70.5pt">
             <v:imagedata r:id="rId13" o:title="logo_"/>
           </v:shape>
         </w:pict>
@@ -4774,8 +4781,6 @@
                 <w:szCs w:val="20"/>
               </w:rPr>
             </w:pPr>
-            <w:bookmarkStart w:id="0" w:name="_GoBack"/>
-            <w:bookmarkEnd w:id="0"/>
             <w:r>
               <w:rPr>
                 <w:rFonts w:ascii="Tahoma" w:hAnsi="Tahoma" w:cs="Tahoma"/>
@@ -4923,7 +4928,7 @@
               <w:adjustRightInd w:val="0"/>
               <w:spacing w:beforeLines="20" w:before="48" w:afterLines="20" w:after="48" w:line="24" w:lineRule="atLeast"/>
               <w:ind w:right="-15"/>
-              <w:jc w:val="right"/>
+              <w:jc w:val="center"/>
               <w:rPr>
                 <w:rFonts w:ascii="Tahoma" w:hAnsi="Tahoma" w:cs="Tahoma"/>
                 <w:noProof/>
@@ -4940,7 +4945,7 @@
                 <w:sz w:val="20"/>
                 <w:szCs w:val="20"/>
               </w:rPr>
-              <w:t>TỔNG TRƯỚC CHIẾT KHẤU</w:t>
+              <w:t>THÀNH TIỀN</w:t>
             </w:r>
           </w:p>
         </w:tc>
@@ -4965,7 +4970,6 @@
               <w:jc w:val="right"/>
               <w:rPr>
                 <w:rFonts w:ascii="Tahoma" w:hAnsi="Tahoma" w:cs="Tahoma"/>
-                <w:b w:val="0"/>
                 <w:noProof/>
                 <w:sz w:val="20"/>
                 <w:szCs w:val="20"/>
@@ -4974,32 +4978,96 @@
             <w:r>
               <w:rPr>
                 <w:rFonts w:ascii="Tahoma" w:hAnsi="Tahoma" w:cs="Tahoma"/>
-                <w:b w:val="0"/>
-                <w:noProof/>
-                <w:sz w:val="20"/>
-                <w:szCs w:val="20"/>
-              </w:rPr>
-              <w:t>{d.</w:t>
-            </w:r>
-            <w:r>
-              <w:rPr>
-                <w:rFonts w:ascii="Tahoma" w:hAnsi="Tahoma" w:cs="Tahoma"/>
-                <w:b w:val="0"/>
-                <w:noProof/>
-                <w:sz w:val="20"/>
-                <w:szCs w:val="20"/>
-              </w:rPr>
-              <w:t>truoc_chiet_khau</w:t>
-            </w:r>
-            <w:r>
-              <w:rPr>
-                <w:rFonts w:ascii="Tahoma" w:hAnsi="Tahoma" w:cs="Tahoma"/>
-                <w:b w:val="0"/>
-                <w:noProof/>
-                <w:sz w:val="20"/>
-                <w:szCs w:val="20"/>
-              </w:rPr>
-              <w:t>}</w:t>
+                <w:noProof/>
+                <w:sz w:val="20"/>
+                <w:szCs w:val="20"/>
+              </w:rPr>
+              <w:t>{d.truoc_chiet_khau}</w:t>
+            </w:r>
+          </w:p>
+        </w:tc>
+        <w:bookmarkStart w:id="0" w:name="_GoBack"/>
+        <w:bookmarkEnd w:id="0"/>
+      </w:tr>
+      <w:tr>
+        <w:trPr>
+          <w:trHeight w:val="260"/>
+        </w:trPr>
+        <w:tc>
+          <w:tcPr>
+            <w:tcW w:w="8280" w:type="dxa"/>
+            <w:gridSpan w:val="4"/>
+            <w:tcBorders>
+              <w:top w:val="single" w:sz="4" w:space="0" w:color="auto"/>
+              <w:bottom w:val="single" w:sz="4" w:space="0" w:color="auto"/>
+            </w:tcBorders>
+          </w:tcPr>
+          <w:p>
+            <w:pPr>
+              <w:widowControl w:val="0"/>
+              <w:tabs>
+                <w:tab w:val="left" w:pos="1949"/>
+              </w:tabs>
+              <w:autoSpaceDE w:val="0"/>
+              <w:autoSpaceDN w:val="0"/>
+              <w:adjustRightInd w:val="0"/>
+              <w:spacing w:beforeLines="20" w:before="48" w:afterLines="20" w:after="48" w:line="24" w:lineRule="atLeast"/>
+              <w:ind w:right="-15"/>
+              <w:jc w:val="center"/>
+              <w:rPr>
+                <w:rFonts w:ascii="Tahoma" w:hAnsi="Tahoma" w:cs="Tahoma"/>
+                <w:noProof/>
+                <w:spacing w:val="-3"/>
+                <w:sz w:val="20"/>
+                <w:szCs w:val="20"/>
+              </w:rPr>
+            </w:pPr>
+            <w:r>
+              <w:rPr>
+                <w:rFonts w:ascii="Tahoma" w:hAnsi="Tahoma" w:cs="Tahoma"/>
+                <w:noProof/>
+                <w:spacing w:val="-3"/>
+                <w:sz w:val="20"/>
+                <w:szCs w:val="20"/>
+              </w:rPr>
+              <w:t>CHIẾT KHẤU</w:t>
+            </w:r>
+          </w:p>
+        </w:tc>
+        <w:tc>
+          <w:tcPr>
+            <w:tcW w:w="1800" w:type="dxa"/>
+            <w:tcBorders>
+              <w:top w:val="single" w:sz="4" w:space="0" w:color="auto"/>
+              <w:bottom w:val="single" w:sz="4" w:space="0" w:color="auto"/>
+            </w:tcBorders>
+          </w:tcPr>
+          <w:p>
+            <w:pPr>
+              <w:widowControl w:val="0"/>
+              <w:tabs>
+                <w:tab w:val="left" w:pos="1949"/>
+              </w:tabs>
+              <w:autoSpaceDE w:val="0"/>
+              <w:autoSpaceDN w:val="0"/>
+              <w:adjustRightInd w:val="0"/>
+              <w:spacing w:beforeLines="20" w:before="48" w:afterLines="20" w:after="48" w:line="24" w:lineRule="atLeast"/>
+              <w:jc w:val="right"/>
+              <w:rPr>
+                <w:rFonts w:ascii="Tahoma" w:hAnsi="Tahoma" w:cs="Tahoma"/>
+                <w:noProof/>
+                <w:sz w:val="20"/>
+                <w:szCs w:val="20"/>
+              </w:rPr>
+            </w:pPr>
+            <w:r>
+              <w:rPr>
+                <w:rFonts w:ascii="Tahoma" w:hAnsi="Tahoma" w:cs="Tahoma"/>
+                <w:noProof/>
+                <w:sz w:val="20"/>
+                <w:szCs w:val="20"/>
+              </w:rPr>
+              <w:t>{d.chiet_khau}</w:t>
             </w:r>
           </w:p>
         </w:tc>
@@ -5028,13 +5096,14 @@
               <w:adjustRightInd w:val="0"/>
               <w:spacing w:beforeLines="20" w:before="48" w:afterLines="20" w:after="48" w:line="24" w:lineRule="atLeast"/>
               <w:ind w:right="-15"/>
-              <w:jc w:val="right"/>
+              <w:jc w:val="center"/>
               <w:rPr>
                 <w:rFonts w:ascii="Tahoma" w:hAnsi="Tahoma" w:cs="Tahoma"/>
                 <w:noProof/>
                 <w:spacing w:val="-3"/>
                 <w:sz w:val="20"/>
                 <w:szCs w:val="20"/>
+                <w:lang w:val="vi-VN"/>
               </w:rPr>
             </w:pPr>
             <w:r>
@@ -5044,8 +5113,9 @@
                 <w:spacing w:val="-3"/>
                 <w:sz w:val="20"/>
                 <w:szCs w:val="20"/>
-              </w:rPr>
-              <w:t>CHIẾT KHẤU TỔNG ĐƠN (%)</w:t>
+                <w:lang w:val="vi-VN"/>
+              </w:rPr>
+              <w:t>TỔNG ĐƠN HÀNG BAO GỒM VAT</w:t>
             </w:r>
           </w:p>
         </w:tc>
@@ -5070,8 +5140,8 @@
               <w:jc w:val="right"/>
               <w:rPr>
                 <w:rFonts w:ascii="Tahoma" w:hAnsi="Tahoma" w:cs="Tahoma"/>
-                <w:b w:val="0"/>
-                <w:noProof/>
+                <w:noProof/>
+                <w:spacing w:val="-3"/>
                 <w:sz w:val="20"/>
                 <w:szCs w:val="20"/>
               </w:rPr>
@@ -5079,114 +5149,6 @@
             <w:r>
               <w:rPr>
                 <w:rFonts w:ascii="Tahoma" w:hAnsi="Tahoma" w:cs="Tahoma"/>
-                <w:b w:val="0"/>
-                <w:noProof/>
-                <w:sz w:val="20"/>
-                <w:szCs w:val="20"/>
-              </w:rPr>
-              <w:t>{d.</w:t>
-            </w:r>
-            <w:r>
-              <w:rPr>
-                <w:rFonts w:ascii="Tahoma" w:hAnsi="Tahoma" w:cs="Tahoma"/>
-                <w:b w:val="0"/>
-                <w:noProof/>
-                <w:sz w:val="20"/>
-                <w:szCs w:val="20"/>
-              </w:rPr>
-              <w:t>chiet_khau</w:t>
-            </w:r>
-            <w:r>
-              <w:rPr>
-                <w:rFonts w:ascii="Tahoma" w:hAnsi="Tahoma" w:cs="Tahoma"/>
-                <w:b w:val="0"/>
-                <w:noProof/>
-                <w:sz w:val="20"/>
-                <w:szCs w:val="20"/>
-              </w:rPr>
-              <w:t>}</w:t>
-            </w:r>
-          </w:p>
-        </w:tc>
-      </w:tr>
-      <w:tr>
-        <w:trPr>
-          <w:trHeight w:val="260"/>
-        </w:trPr>
-        <w:tc>
-          <w:tcPr>
-            <w:tcW w:w="8280" w:type="dxa"/>
-            <w:gridSpan w:val="4"/>
-            <w:tcBorders>
-              <w:top w:val="single" w:sz="4" w:space="0" w:color="auto"/>
-              <w:bottom w:val="single" w:sz="4" w:space="0" w:color="auto"/>
-            </w:tcBorders>
-          </w:tcPr>
-          <w:p>
-            <w:pPr>
-              <w:widowControl w:val="0"/>
-              <w:tabs>
-                <w:tab w:val="left" w:pos="1949"/>
-              </w:tabs>
-              <w:autoSpaceDE w:val="0"/>
-              <w:autoSpaceDN w:val="0"/>
-              <w:adjustRightInd w:val="0"/>
-              <w:spacing w:beforeLines="20" w:before="48" w:afterLines="20" w:after="48" w:line="24" w:lineRule="atLeast"/>
-              <w:ind w:right="-15"/>
-              <w:jc w:val="right"/>
-              <w:rPr>
-                <w:rFonts w:ascii="Tahoma" w:hAnsi="Tahoma" w:cs="Tahoma"/>
-                <w:noProof/>
-                <w:spacing w:val="-3"/>
-                <w:sz w:val="20"/>
-                <w:szCs w:val="20"/>
-                <w:lang w:val="vi-VN"/>
-              </w:rPr>
-            </w:pPr>
-            <w:r>
-              <w:rPr>
-                <w:rFonts w:ascii="Tahoma" w:hAnsi="Tahoma" w:cs="Tahoma"/>
-                <w:noProof/>
-                <w:spacing w:val="-3"/>
-                <w:sz w:val="20"/>
-                <w:szCs w:val="20"/>
-                <w:lang w:val="vi-VN"/>
-              </w:rPr>
-              <w:t>TỔNG THANH TOÁN</w:t>
-            </w:r>
-          </w:p>
-        </w:tc>
-        <w:tc>
-          <w:tcPr>
-            <w:tcW w:w="1800" w:type="dxa"/>
-            <w:tcBorders>
-              <w:top w:val="single" w:sz="4" w:space="0" w:color="auto"/>
-              <w:bottom w:val="single" w:sz="4" w:space="0" w:color="auto"/>
-            </w:tcBorders>
-          </w:tcPr>
-          <w:p>
-            <w:pPr>
-              <w:widowControl w:val="0"/>
-              <w:tabs>
-                <w:tab w:val="left" w:pos="1949"/>
-              </w:tabs>
-              <w:autoSpaceDE w:val="0"/>
-              <w:autoSpaceDN w:val="0"/>
-              <w:adjustRightInd w:val="0"/>
-              <w:spacing w:beforeLines="20" w:before="48" w:afterLines="20" w:after="48" w:line="24" w:lineRule="atLeast"/>
-              <w:jc w:val="right"/>
-              <w:rPr>
-                <w:rFonts w:ascii="Tahoma" w:hAnsi="Tahoma" w:cs="Tahoma"/>
-                <w:noProof/>
-                <w:spacing w:val="-3"/>
-                <w:sz w:val="20"/>
-                <w:szCs w:val="20"/>
-              </w:rPr>
-            </w:pPr>
-            <w:r>
-              <w:rPr>
-                <w:rFonts w:ascii="Tahoma" w:hAnsi="Tahoma" w:cs="Tahoma"/>
-                <w:b w:val="0"/>
                 <w:noProof/>
                 <w:sz w:val="20"/>
                 <w:szCs w:val="20"/>
@@ -6682,7 +6644,7 @@
               <w:szCs w:val="18"/>
               <w:lang w:val="vi-VN" w:eastAsia="vi-VN"/>
             </w:rPr>
-            <w:t>3</w:t>
+            <w:t>2</w:t>
           </w:r>
           <w:r>
             <w:rPr>
@@ -9818,6 +9780,7 @@
   <w:style w:type="character" w:default="1" w:styleId="DefaultParagraphFont">
     <w:name w:val="Default Paragraph Font"/>
     <w:uiPriority w:val="1"/>
+    <w:semiHidden/>
     <w:unhideWhenUsed/>
   </w:style>
   <w:style w:type="table" w:default="1" w:styleId="TableNormal">
@@ -10370,7 +10333,7 @@
 </file>
 
 <file path=customXml/itemProps1.xml><?xml version="1.0" encoding="utf-8"?>
-<ds:datastoreItem xmlns:ds="http://schemas.openxmlformats.org/officeDocument/2006/customXml" ds:itemID="{33015B6A-7E47-40A5-BBEA-0804DE032D68}">
+<ds:datastoreItem xmlns:ds="http://schemas.openxmlformats.org/officeDocument/2006/customXml" ds:itemID="{F3C06F01-A144-4898-8155-4AB543FC7EAE}">
   <ds:schemaRefs>
     <ds:schemaRef ds:uri="http://schemas.openxmlformats.org/officeDocument/2006/bibliography"/>
   </ds:schemaRefs>

</xml_diff>